<commit_message>
docs: update final paper with revised version
Made-with: Cursor
</commit_message>
<xml_diff>
--- a/docs/paper/TechGrowth_Final.docx
+++ b/docs/paper/TechGrowth_Final.docx
@@ -1542,7 +1542,6 @@
               <w:bottom w:color="999999" w:space="0" w:sz="4" w:val="single"/>
               <w:right w:color="999999" w:space="0" w:sz="4" w:val="single"/>
             </w:tcBorders>
-            <w:shd w:fill="2c3e50" w:val="clear"/>
             <w:tcMar>
               <w:top w:w="60.0" w:type="dxa"/>
               <w:left w:w="100.0" w:type="dxa"/>
@@ -1556,8 +1555,11 @@
               <w:jc w:val="center"/>
               <w:rPr>
                 <w:rFonts w:ascii="Times New Roman" w:cs="Times New Roman" w:eastAsia="Times New Roman" w:hAnsi="Times New Roman"/>
+                <w:b w:val="1"/>
+                <w:bCs w:val="1"/>
                 <w:sz w:val="24"/>
                 <w:szCs w:val="24"/>
+                <w:highlight w:val="white"/>
               </w:rPr>
             </w:pPr>
             <w:r>
@@ -1565,9 +1567,9 @@
                 <w:rFonts w:ascii="Times New Roman" w:cs="Times New Roman" w:eastAsia="Times New Roman" w:hAnsi="Times New Roman"/>
                 <w:b w:val="1"/>
                 <w:bCs w:val="1"/>
-                <w:color w:val="ffffff"/>
-                <w:sz w:val="20"/>
-                <w:szCs w:val="20"/>
+                <w:sz w:val="24"/>
+                <w:szCs w:val="24"/>
+                <w:highlight w:val="white"/>
                 <w:rtl w:val="0"/>
               </w:rPr>
               <w:t xml:space="preserve">Regra</w:t>
@@ -1587,7 +1589,6 @@
               <w:bottom w:color="999999" w:space="0" w:sz="4" w:val="single"/>
               <w:right w:color="999999" w:space="0" w:sz="4" w:val="single"/>
             </w:tcBorders>
-            <w:shd w:fill="2c3e50" w:val="clear"/>
             <w:tcMar>
               <w:top w:w="60.0" w:type="dxa"/>
               <w:left w:w="100.0" w:type="dxa"/>
@@ -1601,8 +1602,11 @@
               <w:jc w:val="center"/>
               <w:rPr>
                 <w:rFonts w:ascii="Times New Roman" w:cs="Times New Roman" w:eastAsia="Times New Roman" w:hAnsi="Times New Roman"/>
+                <w:b w:val="1"/>
+                <w:bCs w:val="1"/>
                 <w:sz w:val="24"/>
                 <w:szCs w:val="24"/>
+                <w:highlight w:val="white"/>
               </w:rPr>
             </w:pPr>
             <w:r>
@@ -1610,9 +1614,9 @@
                 <w:rFonts w:ascii="Times New Roman" w:cs="Times New Roman" w:eastAsia="Times New Roman" w:hAnsi="Times New Roman"/>
                 <w:b w:val="1"/>
                 <w:bCs w:val="1"/>
-                <w:color w:val="ffffff"/>
-                <w:sz w:val="20"/>
-                <w:szCs w:val="20"/>
+                <w:sz w:val="24"/>
+                <w:szCs w:val="24"/>
+                <w:highlight w:val="white"/>
                 <w:rtl w:val="0"/>
               </w:rPr>
               <w:t xml:space="preserve">Métrica</w:t>
@@ -1632,7 +1636,6 @@
               <w:bottom w:color="999999" w:space="0" w:sz="4" w:val="single"/>
               <w:right w:color="999999" w:space="0" w:sz="4" w:val="single"/>
             </w:tcBorders>
-            <w:shd w:fill="2c3e50" w:val="clear"/>
             <w:tcMar>
               <w:top w:w="60.0" w:type="dxa"/>
               <w:left w:w="100.0" w:type="dxa"/>
@@ -1646,8 +1649,11 @@
               <w:jc w:val="center"/>
               <w:rPr>
                 <w:rFonts w:ascii="Times New Roman" w:cs="Times New Roman" w:eastAsia="Times New Roman" w:hAnsi="Times New Roman"/>
+                <w:b w:val="1"/>
+                <w:bCs w:val="1"/>
                 <w:sz w:val="24"/>
                 <w:szCs w:val="24"/>
+                <w:highlight w:val="white"/>
               </w:rPr>
             </w:pPr>
             <w:r>
@@ -1655,9 +1661,9 @@
                 <w:rFonts w:ascii="Times New Roman" w:cs="Times New Roman" w:eastAsia="Times New Roman" w:hAnsi="Times New Roman"/>
                 <w:b w:val="1"/>
                 <w:bCs w:val="1"/>
-                <w:color w:val="ffffff"/>
-                <w:sz w:val="20"/>
-                <w:szCs w:val="20"/>
+                <w:sz w:val="24"/>
+                <w:szCs w:val="24"/>
+                <w:highlight w:val="white"/>
                 <w:rtl w:val="0"/>
               </w:rPr>
               <w:t xml:space="preserve">Limiar</w:t>
@@ -1677,7 +1683,6 @@
               <w:bottom w:color="999999" w:space="0" w:sz="4" w:val="single"/>
               <w:right w:color="999999" w:space="0" w:sz="4" w:val="single"/>
             </w:tcBorders>
-            <w:shd w:fill="2c3e50" w:val="clear"/>
             <w:tcMar>
               <w:top w:w="60.0" w:type="dxa"/>
               <w:left w:w="100.0" w:type="dxa"/>
@@ -1691,8 +1696,11 @@
               <w:jc w:val="center"/>
               <w:rPr>
                 <w:rFonts w:ascii="Times New Roman" w:cs="Times New Roman" w:eastAsia="Times New Roman" w:hAnsi="Times New Roman"/>
+                <w:b w:val="1"/>
+                <w:bCs w:val="1"/>
                 <w:sz w:val="24"/>
                 <w:szCs w:val="24"/>
+                <w:highlight w:val="white"/>
               </w:rPr>
             </w:pPr>
             <w:r>
@@ -1700,9 +1708,9 @@
                 <w:rFonts w:ascii="Times New Roman" w:cs="Times New Roman" w:eastAsia="Times New Roman" w:hAnsi="Times New Roman"/>
                 <w:b w:val="1"/>
                 <w:bCs w:val="1"/>
-                <w:color w:val="ffffff"/>
-                <w:sz w:val="20"/>
-                <w:szCs w:val="20"/>
+                <w:sz w:val="24"/>
+                <w:szCs w:val="24"/>
+                <w:highlight w:val="white"/>
                 <w:rtl w:val="0"/>
               </w:rPr>
               <w:t xml:space="preserve">Monitoramento</w:t>
@@ -1722,7 +1730,6 @@
               <w:bottom w:color="999999" w:space="0" w:sz="4" w:val="single"/>
               <w:right w:color="999999" w:space="0" w:sz="4" w:val="single"/>
             </w:tcBorders>
-            <w:shd w:fill="2c3e50" w:val="clear"/>
             <w:tcMar>
               <w:top w:w="60.0" w:type="dxa"/>
               <w:left w:w="100.0" w:type="dxa"/>
@@ -1736,8 +1743,11 @@
               <w:jc w:val="center"/>
               <w:rPr>
                 <w:rFonts w:ascii="Times New Roman" w:cs="Times New Roman" w:eastAsia="Times New Roman" w:hAnsi="Times New Roman"/>
+                <w:b w:val="1"/>
+                <w:bCs w:val="1"/>
                 <w:sz w:val="24"/>
                 <w:szCs w:val="24"/>
+                <w:highlight w:val="white"/>
               </w:rPr>
             </w:pPr>
             <w:r>
@@ -1745,9 +1755,9 @@
                 <w:rFonts w:ascii="Times New Roman" w:cs="Times New Roman" w:eastAsia="Times New Roman" w:hAnsi="Times New Roman"/>
                 <w:b w:val="1"/>
                 <w:bCs w:val="1"/>
-                <w:color w:val="ffffff"/>
-                <w:sz w:val="20"/>
-                <w:szCs w:val="20"/>
+                <w:sz w:val="24"/>
+                <w:szCs w:val="24"/>
+                <w:highlight w:val="white"/>
                 <w:rtl w:val="0"/>
               </w:rPr>
               <w:t xml:space="preserve">Circuit Breaker</w:t>
@@ -1785,8 +1795,9 @@
               <w:spacing w:line="480" w:lineRule="auto"/>
               <w:rPr>
                 <w:rFonts w:ascii="Times New Roman" w:cs="Times New Roman" w:eastAsia="Times New Roman" w:hAnsi="Times New Roman"/>
-                <w:sz w:val="24"/>
-                <w:szCs w:val="24"/>
+                <w:sz w:val="20"/>
+                <w:szCs w:val="20"/>
+                <w:highlight w:val="white"/>
               </w:rPr>
             </w:pPr>
             <w:r>
@@ -1794,14 +1805,10 @@
                 <w:rFonts w:ascii="Times New Roman" w:cs="Times New Roman" w:eastAsia="Times New Roman" w:hAnsi="Times New Roman"/>
                 <w:sz w:val="20"/>
                 <w:szCs w:val="20"/>
+                <w:highlight w:val="white"/>
                 <w:rtl w:val="0"/>
               </w:rPr>
               <w:t xml:space="preserve">R1 Completude</w:t>
-            </w:r>
-            <w:r>
-              <w:rPr>
-                <w:rtl w:val="0"/>
-              </w:rPr>
             </w:r>
           </w:p>
         </w:tc>
@@ -1825,8 +1832,9 @@
               <w:spacing w:line="480" w:lineRule="auto"/>
               <w:rPr>
                 <w:rFonts w:ascii="Times New Roman" w:cs="Times New Roman" w:eastAsia="Times New Roman" w:hAnsi="Times New Roman"/>
-                <w:sz w:val="24"/>
-                <w:szCs w:val="24"/>
+                <w:sz w:val="20"/>
+                <w:szCs w:val="20"/>
+                <w:highlight w:val="white"/>
               </w:rPr>
             </w:pPr>
             <w:r>
@@ -1834,14 +1842,10 @@
                 <w:rFonts w:ascii="Times New Roman" w:cs="Times New Roman" w:eastAsia="Times New Roman" w:hAnsi="Times New Roman"/>
                 <w:sz w:val="20"/>
                 <w:szCs w:val="20"/>
+                <w:highlight w:val="white"/>
                 <w:rtl w:val="0"/>
               </w:rPr>
               <w:t xml:space="preserve">% de order_id, customer_id, total_amount não-nulos</w:t>
-            </w:r>
-            <w:r>
-              <w:rPr>
-                <w:rtl w:val="0"/>
-              </w:rPr>
             </w:r>
           </w:p>
         </w:tc>
@@ -1866,8 +1870,9 @@
               <w:jc w:val="center"/>
               <w:rPr>
                 <w:rFonts w:ascii="Times New Roman" w:cs="Times New Roman" w:eastAsia="Times New Roman" w:hAnsi="Times New Roman"/>
-                <w:sz w:val="24"/>
-                <w:szCs w:val="24"/>
+                <w:sz w:val="20"/>
+                <w:szCs w:val="20"/>
+                <w:highlight w:val="white"/>
               </w:rPr>
             </w:pPr>
             <w:r>
@@ -1875,14 +1880,10 @@
                 <w:rFonts w:ascii="Gungsuh" w:cs="Gungsuh" w:eastAsia="Gungsuh" w:hAnsi="Gungsuh"/>
                 <w:sz w:val="20"/>
                 <w:szCs w:val="20"/>
+                <w:highlight w:val="white"/>
                 <w:rtl w:val="0"/>
               </w:rPr>
               <w:t xml:space="preserve">≥ 99,5%</w:t>
-            </w:r>
-            <w:r>
-              <w:rPr>
-                <w:rtl w:val="0"/>
-              </w:rPr>
             </w:r>
           </w:p>
         </w:tc>
@@ -1906,8 +1907,9 @@
               <w:spacing w:line="480" w:lineRule="auto"/>
               <w:rPr>
                 <w:rFonts w:ascii="Times New Roman" w:cs="Times New Roman" w:eastAsia="Times New Roman" w:hAnsi="Times New Roman"/>
-                <w:sz w:val="24"/>
-                <w:szCs w:val="24"/>
+                <w:sz w:val="20"/>
+                <w:szCs w:val="20"/>
+                <w:highlight w:val="white"/>
               </w:rPr>
             </w:pPr>
             <w:r>
@@ -1915,14 +1917,10 @@
                 <w:rFonts w:ascii="Times New Roman" w:cs="Times New Roman" w:eastAsia="Times New Roman" w:hAnsi="Times New Roman"/>
                 <w:sz w:val="20"/>
                 <w:szCs w:val="20"/>
+                <w:highlight w:val="white"/>
                 <w:rtl w:val="0"/>
               </w:rPr>
               <w:t xml:space="preserve">Great Expectations por micro-batch</w:t>
-            </w:r>
-            <w:r>
-              <w:rPr>
-                <w:rtl w:val="0"/>
-              </w:rPr>
             </w:r>
           </w:p>
         </w:tc>
@@ -1946,8 +1944,9 @@
               <w:spacing w:line="480" w:lineRule="auto"/>
               <w:rPr>
                 <w:rFonts w:ascii="Times New Roman" w:cs="Times New Roman" w:eastAsia="Times New Roman" w:hAnsi="Times New Roman"/>
-                <w:sz w:val="24"/>
-                <w:szCs w:val="24"/>
+                <w:sz w:val="20"/>
+                <w:szCs w:val="20"/>
+                <w:highlight w:val="white"/>
               </w:rPr>
             </w:pPr>
             <w:r>
@@ -1955,14 +1954,10 @@
                 <w:rFonts w:ascii="Cardo" w:cs="Cardo" w:eastAsia="Cardo" w:hAnsi="Cardo"/>
                 <w:sz w:val="20"/>
                 <w:szCs w:val="20"/>
+                <w:highlight w:val="white"/>
                 <w:rtl w:val="0"/>
               </w:rPr>
               <w:t xml:space="preserve">Bloqueio promoção Bronze→Silver</w:t>
-            </w:r>
-            <w:r>
-              <w:rPr>
-                <w:rtl w:val="0"/>
-              </w:rPr>
             </w:r>
           </w:p>
         </w:tc>
@@ -1992,8 +1987,8 @@
               <w:spacing w:line="480" w:lineRule="auto"/>
               <w:rPr>
                 <w:rFonts w:ascii="Times New Roman" w:cs="Times New Roman" w:eastAsia="Times New Roman" w:hAnsi="Times New Roman"/>
-                <w:sz w:val="24"/>
-                <w:szCs w:val="24"/>
+                <w:sz w:val="20"/>
+                <w:szCs w:val="20"/>
               </w:rPr>
             </w:pPr>
             <w:r>
@@ -2004,11 +1999,6 @@
                 <w:rtl w:val="0"/>
               </w:rPr>
               <w:t xml:space="preserve">R2 Unicidade</w:t>
-            </w:r>
-            <w:r>
-              <w:rPr>
-                <w:rtl w:val="0"/>
-              </w:rPr>
             </w:r>
           </w:p>
         </w:tc>
@@ -2032,8 +2022,8 @@
               <w:spacing w:line="480" w:lineRule="auto"/>
               <w:rPr>
                 <w:rFonts w:ascii="Times New Roman" w:cs="Times New Roman" w:eastAsia="Times New Roman" w:hAnsi="Times New Roman"/>
-                <w:sz w:val="24"/>
-                <w:szCs w:val="24"/>
+                <w:sz w:val="20"/>
+                <w:szCs w:val="20"/>
               </w:rPr>
             </w:pPr>
             <w:r>
@@ -2044,11 +2034,6 @@
                 <w:rtl w:val="0"/>
               </w:rPr>
               <w:t xml:space="preserve">order_id duplicados por partição diária</w:t>
-            </w:r>
-            <w:r>
-              <w:rPr>
-                <w:rtl w:val="0"/>
-              </w:rPr>
             </w:r>
           </w:p>
         </w:tc>
@@ -2073,8 +2058,8 @@
               <w:jc w:val="center"/>
               <w:rPr>
                 <w:rFonts w:ascii="Times New Roman" w:cs="Times New Roman" w:eastAsia="Times New Roman" w:hAnsi="Times New Roman"/>
-                <w:sz w:val="24"/>
-                <w:szCs w:val="24"/>
+                <w:sz w:val="20"/>
+                <w:szCs w:val="20"/>
               </w:rPr>
             </w:pPr>
             <w:r>
@@ -2085,11 +2070,6 @@
                 <w:rtl w:val="0"/>
               </w:rPr>
               <w:t xml:space="preserve">0</w:t>
-            </w:r>
-            <w:r>
-              <w:rPr>
-                <w:rtl w:val="0"/>
-              </w:rPr>
             </w:r>
           </w:p>
         </w:tc>
@@ -2113,8 +2093,8 @@
               <w:spacing w:line="480" w:lineRule="auto"/>
               <w:rPr>
                 <w:rFonts w:ascii="Times New Roman" w:cs="Times New Roman" w:eastAsia="Times New Roman" w:hAnsi="Times New Roman"/>
-                <w:sz w:val="24"/>
-                <w:szCs w:val="24"/>
+                <w:sz w:val="20"/>
+                <w:szCs w:val="20"/>
               </w:rPr>
             </w:pPr>
             <w:r>
@@ -2125,11 +2105,6 @@
                 <w:rtl w:val="0"/>
               </w:rPr>
               <w:t xml:space="preserve">Constraint Iceberg pós-ingestão</w:t>
-            </w:r>
-            <w:r>
-              <w:rPr>
-                <w:rtl w:val="0"/>
-              </w:rPr>
             </w:r>
           </w:p>
         </w:tc>
@@ -2153,8 +2128,8 @@
               <w:spacing w:line="480" w:lineRule="auto"/>
               <w:rPr>
                 <w:rFonts w:ascii="Times New Roman" w:cs="Times New Roman" w:eastAsia="Times New Roman" w:hAnsi="Times New Roman"/>
-                <w:sz w:val="24"/>
-                <w:szCs w:val="24"/>
+                <w:sz w:val="20"/>
+                <w:szCs w:val="20"/>
               </w:rPr>
             </w:pPr>
             <w:r>
@@ -2165,11 +2140,6 @@
                 <w:rtl w:val="0"/>
               </w:rPr>
               <w:t xml:space="preserve">Reprocessamento com deduplicação</w:t>
-            </w:r>
-            <w:r>
-              <w:rPr>
-                <w:rtl w:val="0"/>
-              </w:rPr>
             </w:r>
           </w:p>
         </w:tc>
@@ -2199,8 +2169,8 @@
               <w:spacing w:line="480" w:lineRule="auto"/>
               <w:rPr>
                 <w:rFonts w:ascii="Times New Roman" w:cs="Times New Roman" w:eastAsia="Times New Roman" w:hAnsi="Times New Roman"/>
-                <w:sz w:val="24"/>
-                <w:szCs w:val="24"/>
+                <w:sz w:val="20"/>
+                <w:szCs w:val="20"/>
               </w:rPr>
             </w:pPr>
             <w:r>
@@ -2211,11 +2181,6 @@
                 <w:rtl w:val="0"/>
               </w:rPr>
               <w:t xml:space="preserve">R3 Integridade</w:t>
-            </w:r>
-            <w:r>
-              <w:rPr>
-                <w:rtl w:val="0"/>
-              </w:rPr>
             </w:r>
           </w:p>
         </w:tc>
@@ -2239,8 +2204,8 @@
               <w:spacing w:line="480" w:lineRule="auto"/>
               <w:rPr>
                 <w:rFonts w:ascii="Times New Roman" w:cs="Times New Roman" w:eastAsia="Times New Roman" w:hAnsi="Times New Roman"/>
-                <w:sz w:val="24"/>
-                <w:szCs w:val="24"/>
+                <w:sz w:val="20"/>
+                <w:szCs w:val="20"/>
               </w:rPr>
             </w:pPr>
             <w:r>
@@ -2251,11 +2216,6 @@
                 <w:rtl w:val="0"/>
               </w:rPr>
               <w:t xml:space="preserve">% session_id em conversões presentes na tabela de sessões</w:t>
-            </w:r>
-            <w:r>
-              <w:rPr>
-                <w:rtl w:val="0"/>
-              </w:rPr>
             </w:r>
           </w:p>
         </w:tc>
@@ -2280,8 +2240,8 @@
               <w:jc w:val="center"/>
               <w:rPr>
                 <w:rFonts w:ascii="Times New Roman" w:cs="Times New Roman" w:eastAsia="Times New Roman" w:hAnsi="Times New Roman"/>
-                <w:sz w:val="24"/>
-                <w:szCs w:val="24"/>
+                <w:sz w:val="20"/>
+                <w:szCs w:val="20"/>
               </w:rPr>
             </w:pPr>
             <w:r>
@@ -2292,11 +2252,6 @@
                 <w:rtl w:val="0"/>
               </w:rPr>
               <w:t xml:space="preserve">≥ 99,0%</w:t>
-            </w:r>
-            <w:r>
-              <w:rPr>
-                <w:rtl w:val="0"/>
-              </w:rPr>
             </w:r>
           </w:p>
         </w:tc>
@@ -2320,8 +2275,8 @@
               <w:spacing w:line="480" w:lineRule="auto"/>
               <w:rPr>
                 <w:rFonts w:ascii="Times New Roman" w:cs="Times New Roman" w:eastAsia="Times New Roman" w:hAnsi="Times New Roman"/>
-                <w:sz w:val="24"/>
-                <w:szCs w:val="24"/>
+                <w:sz w:val="20"/>
+                <w:szCs w:val="20"/>
               </w:rPr>
             </w:pPr>
             <w:r>
@@ -2332,11 +2287,6 @@
                 <w:rtl w:val="0"/>
               </w:rPr>
               <w:t xml:space="preserve">Validação cross-table Silver→Gold</w:t>
-            </w:r>
-            <w:r>
-              <w:rPr>
-                <w:rtl w:val="0"/>
-              </w:rPr>
             </w:r>
           </w:p>
         </w:tc>
@@ -2360,8 +2310,8 @@
               <w:spacing w:line="480" w:lineRule="auto"/>
               <w:rPr>
                 <w:rFonts w:ascii="Times New Roman" w:cs="Times New Roman" w:eastAsia="Times New Roman" w:hAnsi="Times New Roman"/>
-                <w:sz w:val="24"/>
-                <w:szCs w:val="24"/>
+                <w:sz w:val="20"/>
+                <w:szCs w:val="20"/>
               </w:rPr>
             </w:pPr>
             <w:r>
@@ -2372,11 +2322,6 @@
                 <w:rtl w:val="0"/>
               </w:rPr>
               <w:t xml:space="preserve">Alerta P1 + quarentena do lote</w:t>
-            </w:r>
-            <w:r>
-              <w:rPr>
-                <w:rtl w:val="0"/>
-              </w:rPr>
             </w:r>
           </w:p>
         </w:tc>
@@ -2406,8 +2351,8 @@
               <w:spacing w:line="480" w:lineRule="auto"/>
               <w:rPr>
                 <w:rFonts w:ascii="Times New Roman" w:cs="Times New Roman" w:eastAsia="Times New Roman" w:hAnsi="Times New Roman"/>
-                <w:sz w:val="24"/>
-                <w:szCs w:val="24"/>
+                <w:sz w:val="20"/>
+                <w:szCs w:val="20"/>
               </w:rPr>
             </w:pPr>
             <w:r>
@@ -2418,11 +2363,6 @@
                 <w:rtl w:val="0"/>
               </w:rPr>
               <w:t xml:space="preserve">R4 Freshness</w:t>
-            </w:r>
-            <w:r>
-              <w:rPr>
-                <w:rtl w:val="0"/>
-              </w:rPr>
             </w:r>
           </w:p>
         </w:tc>
@@ -2446,8 +2386,8 @@
               <w:spacing w:line="480" w:lineRule="auto"/>
               <w:rPr>
                 <w:rFonts w:ascii="Times New Roman" w:cs="Times New Roman" w:eastAsia="Times New Roman" w:hAnsi="Times New Roman"/>
-                <w:sz w:val="24"/>
-                <w:szCs w:val="24"/>
+                <w:sz w:val="20"/>
+                <w:szCs w:val="20"/>
               </w:rPr>
             </w:pPr>
             <w:r>
@@ -2458,11 +2398,6 @@
                 <w:rtl w:val="0"/>
               </w:rPr>
               <w:t xml:space="preserve">now() - max(event_timestamp) por tópico</w:t>
-            </w:r>
-            <w:r>
-              <w:rPr>
-                <w:rtl w:val="0"/>
-              </w:rPr>
             </w:r>
           </w:p>
         </w:tc>
@@ -2487,8 +2422,8 @@
               <w:jc w:val="center"/>
               <w:rPr>
                 <w:rFonts w:ascii="Times New Roman" w:cs="Times New Roman" w:eastAsia="Times New Roman" w:hAnsi="Times New Roman"/>
-                <w:sz w:val="24"/>
-                <w:szCs w:val="24"/>
+                <w:sz w:val="20"/>
+                <w:szCs w:val="20"/>
               </w:rPr>
             </w:pPr>
             <w:r>
@@ -2499,11 +2434,6 @@
                 <w:rtl w:val="0"/>
               </w:rPr>
               <w:t xml:space="preserve">≤ 5min / 6h</w:t>
-            </w:r>
-            <w:r>
-              <w:rPr>
-                <w:rtl w:val="0"/>
-              </w:rPr>
             </w:r>
           </w:p>
         </w:tc>
@@ -2527,8 +2457,8 @@
               <w:spacing w:line="480" w:lineRule="auto"/>
               <w:rPr>
                 <w:rFonts w:ascii="Times New Roman" w:cs="Times New Roman" w:eastAsia="Times New Roman" w:hAnsi="Times New Roman"/>
-                <w:sz w:val="24"/>
-                <w:szCs w:val="24"/>
+                <w:sz w:val="20"/>
+                <w:szCs w:val="20"/>
               </w:rPr>
             </w:pPr>
             <w:r>
@@ -2539,11 +2469,6 @@
                 <w:rtl w:val="0"/>
               </w:rPr>
               <w:t xml:space="preserve">SLI em Prometheus/Grafana</w:t>
-            </w:r>
-            <w:r>
-              <w:rPr>
-                <w:rtl w:val="0"/>
-              </w:rPr>
             </w:r>
           </w:p>
         </w:tc>
@@ -2567,8 +2492,8 @@
               <w:spacing w:line="480" w:lineRule="auto"/>
               <w:rPr>
                 <w:rFonts w:ascii="Times New Roman" w:cs="Times New Roman" w:eastAsia="Times New Roman" w:hAnsi="Times New Roman"/>
-                <w:sz w:val="24"/>
-                <w:szCs w:val="24"/>
+                <w:sz w:val="20"/>
+                <w:szCs w:val="20"/>
               </w:rPr>
             </w:pPr>
             <w:r>
@@ -2579,11 +2504,6 @@
                 <w:rtl w:val="0"/>
               </w:rPr>
               <w:t xml:space="preserve">Auto-scaling consumers Flink</w:t>
-            </w:r>
-            <w:r>
-              <w:rPr>
-                <w:rtl w:val="0"/>
-              </w:rPr>
             </w:r>
           </w:p>
         </w:tc>
@@ -2613,8 +2533,8 @@
               <w:spacing w:line="480" w:lineRule="auto"/>
               <w:rPr>
                 <w:rFonts w:ascii="Times New Roman" w:cs="Times New Roman" w:eastAsia="Times New Roman" w:hAnsi="Times New Roman"/>
-                <w:sz w:val="24"/>
-                <w:szCs w:val="24"/>
+                <w:sz w:val="20"/>
+                <w:szCs w:val="20"/>
               </w:rPr>
             </w:pPr>
             <w:r>
@@ -2625,11 +2545,6 @@
                 <w:rtl w:val="0"/>
               </w:rPr>
               <w:t xml:space="preserve">R5 Schema</w:t>
-            </w:r>
-            <w:r>
-              <w:rPr>
-                <w:rtl w:val="0"/>
-              </w:rPr>
             </w:r>
           </w:p>
         </w:tc>
@@ -2653,8 +2568,8 @@
               <w:spacing w:line="480" w:lineRule="auto"/>
               <w:rPr>
                 <w:rFonts w:ascii="Times New Roman" w:cs="Times New Roman" w:eastAsia="Times New Roman" w:hAnsi="Times New Roman"/>
-                <w:sz w:val="24"/>
-                <w:szCs w:val="24"/>
+                <w:sz w:val="20"/>
+                <w:szCs w:val="20"/>
               </w:rPr>
             </w:pPr>
             <w:r>
@@ -2665,11 +2580,6 @@
                 <w:rtl w:val="0"/>
               </w:rPr>
               <w:t xml:space="preserve">% eventos validados pelo Data Contract</w:t>
-            </w:r>
-            <w:r>
-              <w:rPr>
-                <w:rtl w:val="0"/>
-              </w:rPr>
             </w:r>
           </w:p>
         </w:tc>
@@ -2694,8 +2604,8 @@
               <w:jc w:val="center"/>
               <w:rPr>
                 <w:rFonts w:ascii="Times New Roman" w:cs="Times New Roman" w:eastAsia="Times New Roman" w:hAnsi="Times New Roman"/>
-                <w:sz w:val="24"/>
-                <w:szCs w:val="24"/>
+                <w:sz w:val="20"/>
+                <w:szCs w:val="20"/>
               </w:rPr>
             </w:pPr>
             <w:r>
@@ -2706,11 +2616,6 @@
                 <w:rtl w:val="0"/>
               </w:rPr>
               <w:t xml:space="preserve">100%</w:t>
-            </w:r>
-            <w:r>
-              <w:rPr>
-                <w:rtl w:val="0"/>
-              </w:rPr>
             </w:r>
           </w:p>
         </w:tc>
@@ -2734,8 +2639,8 @@
               <w:spacing w:line="480" w:lineRule="auto"/>
               <w:rPr>
                 <w:rFonts w:ascii="Times New Roman" w:cs="Times New Roman" w:eastAsia="Times New Roman" w:hAnsi="Times New Roman"/>
-                <w:sz w:val="24"/>
-                <w:szCs w:val="24"/>
+                <w:sz w:val="20"/>
+                <w:szCs w:val="20"/>
               </w:rPr>
             </w:pPr>
             <w:r>
@@ -2746,11 +2651,6 @@
                 <w:rtl w:val="0"/>
               </w:rPr>
               <w:t xml:space="preserve">Compile-time + runtime via registry</w:t>
-            </w:r>
-            <w:r>
-              <w:rPr>
-                <w:rtl w:val="0"/>
-              </w:rPr>
             </w:r>
           </w:p>
         </w:tc>
@@ -2774,8 +2674,8 @@
               <w:spacing w:line="480" w:lineRule="auto"/>
               <w:rPr>
                 <w:rFonts w:ascii="Times New Roman" w:cs="Times New Roman" w:eastAsia="Times New Roman" w:hAnsi="Times New Roman"/>
-                <w:sz w:val="24"/>
-                <w:szCs w:val="24"/>
+                <w:sz w:val="20"/>
+                <w:szCs w:val="20"/>
               </w:rPr>
             </w:pPr>
             <w:r>
@@ -2786,11 +2686,6 @@
                 <w:rtl w:val="0"/>
               </w:rPr>
               <w:t xml:space="preserve">Rejeição para dead-letter queue</w:t>
-            </w:r>
-            <w:r>
-              <w:rPr>
-                <w:rtl w:val="0"/>
-              </w:rPr>
             </w:r>
           </w:p>
         </w:tc>
@@ -3047,7 +2942,47 @@
           <w:szCs w:val="24"/>
           <w:rtl w:val="0"/>
         </w:rPr>
-        <w:t xml:space="preserve">O teorema PACELC (Abadi, 2012) formaliza os compromissos: durante partições, escolhe-se disponibilidade ou consistência; caso contrário, latência ou consistência. Um Data Warehouse proprietário não foi escolhido porque acopla armazenamento e computação, amplia lock-in e reduz flexibilidade para imagens e JSON semiestruturado. A Arquitetura Kappa foi preferida à Lambda porque evita duplicidade de lógica entre batch e streaming, reduz superfícies de falha e simplifica a reconciliação operacional. No streaming (PA/EL), painéis podem exibir defasagem de segundos durante partições. No Continuous Close (PC/EC), prioriza-se consistência forte para números financeiros. O merge-on-read do Iceberg transfere custo para leitura; mitiga-se via compactação periódica e reordenação física por colunas filtradas, reduzindo penalidade operacional para níveis aceitáveis.</w:t>
+        <w:t xml:space="preserve">O teorema PACELC (Abadi, 2012) formaliza os compromissos: durante partições, escolhe-se disponibilidade ou consistência; caso contrário, latência ou consistência. Um Data Warehouse proprietário não foi escolhido porque acopla armazenamento e computação, amplia lock-in e reduz flexibilidade para imagens e JSON semiestruturado. A Arquitetura Kappa foi preferida à Lambda porque evita duplicidade de lógica entre batch e streaming, reduz superfícies de falha e simplifica a reconciliação operacional. No streaming (PA/EL), painéis podem exibir defasagem de segundos durante partições. No </w:t>
+      </w:r>
+      <w:r>
+        <w:rPr>
+          <w:rFonts w:ascii="Times New Roman" w:cs="Times New Roman" w:eastAsia="Times New Roman" w:hAnsi="Times New Roman"/>
+          <w:i w:val="1"/>
+          <w:iCs w:val="1"/>
+          <w:sz w:val="24"/>
+          <w:szCs w:val="24"/>
+          <w:rtl w:val="0"/>
+        </w:rPr>
+        <w:t xml:space="preserve">Continuous Close</w:t>
+      </w:r>
+      <w:r>
+        <w:rPr>
+          <w:rFonts w:ascii="Times New Roman" w:cs="Times New Roman" w:eastAsia="Times New Roman" w:hAnsi="Times New Roman"/>
+          <w:sz w:val="24"/>
+          <w:szCs w:val="24"/>
+          <w:rtl w:val="0"/>
+        </w:rPr>
+        <w:t xml:space="preserve"> (PC/EC), a priorização recai sobre a consistência forte exigida pelos registros financeiros. O mecanismo </w:t>
+      </w:r>
+      <w:r>
+        <w:rPr>
+          <w:rFonts w:ascii="Times New Roman" w:cs="Times New Roman" w:eastAsia="Times New Roman" w:hAnsi="Times New Roman"/>
+          <w:i w:val="1"/>
+          <w:iCs w:val="1"/>
+          <w:sz w:val="24"/>
+          <w:szCs w:val="24"/>
+          <w:rtl w:val="0"/>
+        </w:rPr>
+        <w:t xml:space="preserve">merge-on-read</w:t>
+      </w:r>
+      <w:r>
+        <w:rPr>
+          <w:rFonts w:ascii="Times New Roman" w:cs="Times New Roman" w:eastAsia="Times New Roman" w:hAnsi="Times New Roman"/>
+          <w:sz w:val="24"/>
+          <w:szCs w:val="24"/>
+          <w:rtl w:val="0"/>
+        </w:rPr>
+        <w:t xml:space="preserve"> do Iceberg desloca o ônus para a leitura; tal efeito é mitigado por compactação periódica e reordenação física baseada em colunas filtradas, reduzindo a penalidade operacional a patamares aceitáveis.</w:t>
       </w:r>
       <w:r>
         <w:rPr>
@@ -3060,6 +2995,29 @@
         <w:spacing w:line="480" w:lineRule="auto"/>
         <w:ind w:firstLine="720"/>
         <w:jc w:val="both"/>
+        <w:rPr/>
+      </w:pPr>
+      <w:r>
+        <w:rPr>
+          <w:rFonts w:ascii="Gungsuh" w:cs="Gungsuh" w:eastAsia="Gungsuh" w:hAnsi="Gungsuh"/>
+          <w:sz w:val="24"/>
+          <w:szCs w:val="24"/>
+          <w:rtl w:val="0"/>
+        </w:rPr>
+        <w:t xml:space="preserve">A Simulação de Eventos Discretos (Flores, 2026) consolidou a evidência empírica: 191.317 eventos processados com 100% de conformidade com os SLAs sob estresse de 5.800 eps. A injeção de duas partições de rede elevou o P99 da célula afetada em 16% (3.206 ms vs. 2.764 ms na média global), mantendo, contudo, a integridade total. O isolamento celular restringiu o impacto a 58 eventos (0,03%). A Lei de Little (1961) foi verificada (L ≈ 7.058 eventos simultâneos), sustentada por 140 consumidores. O detalhamento metodológico, artefatos experimentais e validações gráficas estão disponíveis como material suplementar reprodutível (Flores, 2026).</w:t>
+      </w:r>
+      <w:r>
+        <w:rPr>
+          <w:rtl w:val="0"/>
+        </w:rPr>
+      </w:r>
+    </w:p>
+    <w:p>
+      <w:pPr>
+        <w:pStyle w:val="Heading1"/>
+        <w:keepNext w:val="0"/>
+        <w:keepLines w:val="0"/>
+        <w:spacing w:before="240" w:line="480" w:lineRule="auto"/>
         <w:rPr>
           <w:rFonts w:ascii="Times New Roman" w:cs="Times New Roman" w:eastAsia="Times New Roman" w:hAnsi="Times New Roman"/>
           <w:b w:val="1"/>
@@ -3070,33 +3028,189 @@
       </w:pPr>
       <w:r>
         <w:rPr>
-          <w:rFonts w:ascii="Gungsuh" w:cs="Gungsuh" w:eastAsia="Gungsuh" w:hAnsi="Gungsuh"/>
-          <w:sz w:val="24"/>
-          <w:szCs w:val="24"/>
-          <w:rtl w:val="0"/>
-        </w:rPr>
-        <w:t xml:space="preserve">A Simulação de Eventos Discretos (Flores, 2026) forneceu evidência empírica: 191.317 eventos processados com 100% de conformidade SLA sob estresse de 5.800 eps, com duas partições de rede injetadas que elevaram o P99 da célula afetada em 16% (3.206 ms vs. 2.764 ms geral), porém mantiveram conformidade total. O isolamento celular limitou o impacto a 58 eventos (0,03%). A Lei de Little (1961) foi verificada: L ≈ 7.058 eventos simultâneos, sustentados por 140 consumidores. O detalhamento metodológico complementar, os artefatos experimentais e os gráficos de validação encontram-se disponibilizados como material suplementar reprodutível (Flores, 2026).</w:t>
-      </w:r>
-      <w:r>
-        <w:rPr>
-          <w:rtl w:val="0"/>
-        </w:rPr>
-      </w:r>
-    </w:p>
-    <w:p>
-      <w:pPr>
-        <w:pStyle w:val="Heading1"/>
-        <w:keepNext w:val="0"/>
-        <w:keepLines w:val="0"/>
-        <w:spacing w:before="240" w:line="480" w:lineRule="auto"/>
-        <w:rPr>
           <w:rFonts w:ascii="Times New Roman" w:cs="Times New Roman" w:eastAsia="Times New Roman" w:hAnsi="Times New Roman"/>
           <w:b w:val="1"/>
           <w:bCs w:val="1"/>
           <w:sz w:val="28"/>
           <w:szCs w:val="28"/>
-        </w:rPr>
-      </w:pPr>
+          <w:rtl w:val="0"/>
+        </w:rPr>
+        <w:t xml:space="preserve">3. Considerações Finais</w:t>
+      </w:r>
+    </w:p>
+    <w:p>
+      <w:pPr>
+        <w:spacing w:line="480" w:lineRule="auto"/>
+        <w:ind w:firstLine="720"/>
+        <w:jc w:val="both"/>
+        <w:rPr>
+          <w:rFonts w:ascii="Times New Roman" w:cs="Times New Roman" w:eastAsia="Times New Roman" w:hAnsi="Times New Roman"/>
+          <w:sz w:val="24"/>
+          <w:szCs w:val="24"/>
+        </w:rPr>
+      </w:pPr>
+      <w:r>
+        <w:rPr>
+          <w:rFonts w:ascii="Times New Roman" w:cs="Times New Roman" w:eastAsia="Times New Roman" w:hAnsi="Times New Roman"/>
+          <w:sz w:val="24"/>
+          <w:szCs w:val="24"/>
+          <w:rtl w:val="0"/>
+        </w:rPr>
+        <w:t xml:space="preserve">A arquitetura </w:t>
+      </w:r>
+      <w:r>
+        <w:rPr>
+          <w:rFonts w:ascii="Times New Roman" w:cs="Times New Roman" w:eastAsia="Times New Roman" w:hAnsi="Times New Roman"/>
+          <w:i w:val="1"/>
+          <w:iCs w:val="1"/>
+          <w:sz w:val="24"/>
+          <w:szCs w:val="24"/>
+          <w:rtl w:val="0"/>
+        </w:rPr>
+        <w:t xml:space="preserve">Data Lakehouse</w:t>
+      </w:r>
+      <w:r>
+        <w:rPr>
+          <w:rFonts w:ascii="Times New Roman" w:cs="Times New Roman" w:eastAsia="Times New Roman" w:hAnsi="Times New Roman"/>
+          <w:sz w:val="24"/>
+          <w:szCs w:val="24"/>
+          <w:rtl w:val="0"/>
+        </w:rPr>
+        <w:t xml:space="preserve"> sobre Apache Iceberg, com ingestão dual Kappa e </w:t>
+      </w:r>
+      <w:r>
+        <w:rPr>
+          <w:rFonts w:ascii="Times New Roman" w:cs="Times New Roman" w:eastAsia="Times New Roman" w:hAnsi="Times New Roman"/>
+          <w:i w:val="1"/>
+          <w:iCs w:val="1"/>
+          <w:sz w:val="24"/>
+          <w:szCs w:val="24"/>
+          <w:rtl w:val="0"/>
+        </w:rPr>
+        <w:t xml:space="preserve">Continuous Close</w:t>
+      </w:r>
+      <w:r>
+        <w:rPr>
+          <w:rFonts w:ascii="Times New Roman" w:cs="Times New Roman" w:eastAsia="Times New Roman" w:hAnsi="Times New Roman"/>
+          <w:sz w:val="24"/>
+          <w:szCs w:val="24"/>
+          <w:rtl w:val="0"/>
+        </w:rPr>
+        <w:t xml:space="preserve">, resolve as três questões da TechGrowth. A lucratividade real é viabilizada pela conciliação financeira na camada Gold com contratos de dados; o </w:t>
+      </w:r>
+      <w:r>
+        <w:rPr>
+          <w:rFonts w:ascii="Times New Roman" w:cs="Times New Roman" w:eastAsia="Times New Roman" w:hAnsi="Times New Roman"/>
+          <w:i w:val="1"/>
+          <w:iCs w:val="1"/>
+          <w:sz w:val="24"/>
+          <w:szCs w:val="24"/>
+          <w:rtl w:val="0"/>
+        </w:rPr>
+        <w:t xml:space="preserve">Continuous Close</w:t>
+      </w:r>
+      <w:r>
+        <w:rPr>
+          <w:rFonts w:ascii="Times New Roman" w:cs="Times New Roman" w:eastAsia="Times New Roman" w:hAnsi="Times New Roman"/>
+          <w:sz w:val="24"/>
+          <w:szCs w:val="24"/>
+          <w:rtl w:val="0"/>
+        </w:rPr>
+        <w:t xml:space="preserve"> reduz visibilidade de D+1 para D+0,25 (75%). A mensuração do funil é habilitada pelo </w:t>
+      </w:r>
+      <w:r>
+        <w:rPr>
+          <w:rFonts w:ascii="Times New Roman" w:cs="Times New Roman" w:eastAsia="Times New Roman" w:hAnsi="Times New Roman"/>
+          <w:i w:val="1"/>
+          <w:iCs w:val="1"/>
+          <w:sz w:val="24"/>
+          <w:szCs w:val="24"/>
+          <w:rtl w:val="0"/>
+        </w:rPr>
+        <w:t xml:space="preserve">streaming</w:t>
+      </w:r>
+      <w:r>
+        <w:rPr>
+          <w:rFonts w:ascii="Times New Roman" w:cs="Times New Roman" w:eastAsia="Times New Roman" w:hAnsi="Times New Roman"/>
+          <w:sz w:val="24"/>
+          <w:szCs w:val="24"/>
+          <w:rtl w:val="0"/>
+        </w:rPr>
+        <w:t xml:space="preserve"> com latência inferior a cinco minutos, validada pela simulação (Flores, 2026): 191.317 eventos, 100% SLA, duas partições PACELC com isolamento celular. A previsão de demanda é sustentada pela disponibilidade de 99,0% e pelas cinco regras de qualidade com disjuntores.</w:t>
+      </w:r>
+    </w:p>
+    <w:p>
+      <w:pPr>
+        <w:spacing w:line="480" w:lineRule="auto"/>
+        <w:ind w:firstLine="720"/>
+        <w:jc w:val="both"/>
+        <w:rPr>
+          <w:rFonts w:ascii="Times New Roman" w:cs="Times New Roman" w:eastAsia="Times New Roman" w:hAnsi="Times New Roman"/>
+          <w:sz w:val="24"/>
+          <w:szCs w:val="24"/>
+        </w:rPr>
+      </w:pPr>
+      <w:r>
+        <w:rPr>
+          <w:rFonts w:ascii="Times New Roman" w:cs="Times New Roman" w:eastAsia="Times New Roman" w:hAnsi="Times New Roman"/>
+          <w:sz w:val="24"/>
+          <w:szCs w:val="24"/>
+          <w:rtl w:val="0"/>
+        </w:rPr>
+        <w:t xml:space="preserve">A conformidade LGPD sobre Parquet imutável é garantida pela destruição criptográfica de chaves por cliente, eliminando a tensão entre imutabilidade analítica e direito de eliminação. A Lei de Conway (1968), validada por MacCormack, Baldwin, e Rusnak (2012), revela que silos de comunicação geram silos de dados; por isso, a arquitetura proposta requer alinhamento entre domínios, governança e modularidade operacional: equipes por domínio produzem, </w:t>
+      </w:r>
+      <w:r>
+        <w:rPr>
+          <w:rFonts w:ascii="Times New Roman" w:cs="Times New Roman" w:eastAsia="Times New Roman" w:hAnsi="Times New Roman"/>
+          <w:i w:val="1"/>
+          <w:iCs w:val="1"/>
+          <w:sz w:val="24"/>
+          <w:szCs w:val="24"/>
+          <w:rtl w:val="0"/>
+        </w:rPr>
+        <w:t xml:space="preserve">ceteris paribus</w:t>
+      </w:r>
+      <w:r>
+        <w:rPr>
+          <w:rFonts w:ascii="Times New Roman" w:cs="Times New Roman" w:eastAsia="Times New Roman" w:hAnsi="Times New Roman"/>
+          <w:sz w:val="24"/>
+          <w:szCs w:val="24"/>
+          <w:rtl w:val="0"/>
+        </w:rPr>
+        <w:t xml:space="preserve">, arquiteturas modulares. O equilíbrio entre inovação, riscos e maturidade é o desafio contínuo da gestão de plataformas de dados.</w:t>
+      </w:r>
+    </w:p>
+    <w:p>
+      <w:pPr>
+        <w:spacing w:line="480" w:lineRule="auto"/>
+        <w:ind w:firstLine="720"/>
+        <w:jc w:val="both"/>
+        <w:rPr>
+          <w:rFonts w:ascii="Times New Roman" w:cs="Times New Roman" w:eastAsia="Times New Roman" w:hAnsi="Times New Roman"/>
+          <w:sz w:val="24"/>
+          <w:szCs w:val="24"/>
+        </w:rPr>
+      </w:pPr>
+      <w:r>
+        <w:rPr>
+          <w:rFonts w:ascii="Times New Roman" w:cs="Times New Roman" w:eastAsia="Times New Roman" w:hAnsi="Times New Roman"/>
+          <w:sz w:val="24"/>
+          <w:szCs w:val="24"/>
+          <w:rtl w:val="0"/>
+        </w:rPr>
+        <w:t xml:space="preserve">Direções futuras: (i) simulação com múltiplas repetições e intervalos de confiança de 95%; (ii) análise de sensibilidade paramétrica; (iii) criptografia pós-quântica. O teorema PACELC (Abadi, 2012) garante que perfeição é inatingível em sistemas distribuídos; a arquitetura proposta representa o equilíbrio ótimo validado por evidência empírica reprodutível.</w:t>
+      </w:r>
+    </w:p>
+    <w:p>
+      <w:pPr>
+        <w:pStyle w:val="Heading1"/>
+        <w:pageBreakBefore w:val="1"/>
+        <w:spacing w:before="240" w:line="480" w:lineRule="auto"/>
+        <w:jc w:val="center"/>
+        <w:rPr/>
+      </w:pPr>
+      <w:bookmarkStart w:colFirst="0" w:colLast="0" w:name="_7jmf1qcl2acy" w:id="0"/>
+      <w:bookmarkEnd w:id="0"/>
       <w:r>
         <w:rPr>
           <w:rFonts w:ascii="Times New Roman" w:cs="Times New Roman" w:eastAsia="Times New Roman" w:hAnsi="Times New Roman"/>
@@ -3106,197 +3220,6 @@
           <w:szCs w:val="28"/>
           <w:rtl w:val="0"/>
         </w:rPr>
-        <w:t xml:space="preserve">3. Considerações Finais</w:t>
-      </w:r>
-    </w:p>
-    <w:p>
-      <w:pPr>
-        <w:spacing w:line="480" w:lineRule="auto"/>
-        <w:ind w:firstLine="720"/>
-        <w:jc w:val="both"/>
-        <w:rPr>
-          <w:rFonts w:ascii="Times New Roman" w:cs="Times New Roman" w:eastAsia="Times New Roman" w:hAnsi="Times New Roman"/>
-          <w:sz w:val="24"/>
-          <w:szCs w:val="24"/>
-        </w:rPr>
-      </w:pPr>
-      <w:r>
-        <w:rPr>
-          <w:rFonts w:ascii="Times New Roman" w:cs="Times New Roman" w:eastAsia="Times New Roman" w:hAnsi="Times New Roman"/>
-          <w:sz w:val="24"/>
-          <w:szCs w:val="24"/>
-          <w:rtl w:val="0"/>
-        </w:rPr>
-        <w:t xml:space="preserve">A arquitetura </w:t>
-      </w:r>
-      <w:r>
-        <w:rPr>
-          <w:rFonts w:ascii="Times New Roman" w:cs="Times New Roman" w:eastAsia="Times New Roman" w:hAnsi="Times New Roman"/>
-          <w:i w:val="1"/>
-          <w:iCs w:val="1"/>
-          <w:sz w:val="24"/>
-          <w:szCs w:val="24"/>
-          <w:rtl w:val="0"/>
-        </w:rPr>
-        <w:t xml:space="preserve">Data Lakehouse</w:t>
-      </w:r>
-      <w:r>
-        <w:rPr>
-          <w:rFonts w:ascii="Times New Roman" w:cs="Times New Roman" w:eastAsia="Times New Roman" w:hAnsi="Times New Roman"/>
-          <w:sz w:val="24"/>
-          <w:szCs w:val="24"/>
-          <w:rtl w:val="0"/>
-        </w:rPr>
-        <w:t xml:space="preserve"> sobre Apache Iceberg, com ingestão dual Kappa e </w:t>
-      </w:r>
-      <w:r>
-        <w:rPr>
-          <w:rFonts w:ascii="Times New Roman" w:cs="Times New Roman" w:eastAsia="Times New Roman" w:hAnsi="Times New Roman"/>
-          <w:i w:val="1"/>
-          <w:iCs w:val="1"/>
-          <w:sz w:val="24"/>
-          <w:szCs w:val="24"/>
-          <w:rtl w:val="0"/>
-        </w:rPr>
-        <w:t xml:space="preserve">Continuous Close</w:t>
-      </w:r>
-      <w:r>
-        <w:rPr>
-          <w:rFonts w:ascii="Times New Roman" w:cs="Times New Roman" w:eastAsia="Times New Roman" w:hAnsi="Times New Roman"/>
-          <w:sz w:val="24"/>
-          <w:szCs w:val="24"/>
-          <w:rtl w:val="0"/>
-        </w:rPr>
-        <w:t xml:space="preserve">, resolve as três questões da TechGrowth. A lucratividade real é viabilizada pela conciliação financeira na camada Gold com contratos de dados; o </w:t>
-      </w:r>
-      <w:r>
-        <w:rPr>
-          <w:rFonts w:ascii="Times New Roman" w:cs="Times New Roman" w:eastAsia="Times New Roman" w:hAnsi="Times New Roman"/>
-          <w:i w:val="1"/>
-          <w:iCs w:val="1"/>
-          <w:sz w:val="24"/>
-          <w:szCs w:val="24"/>
-          <w:rtl w:val="0"/>
-        </w:rPr>
-        <w:t xml:space="preserve">Continuous Close</w:t>
-      </w:r>
-      <w:r>
-        <w:rPr>
-          <w:rFonts w:ascii="Times New Roman" w:cs="Times New Roman" w:eastAsia="Times New Roman" w:hAnsi="Times New Roman"/>
-          <w:sz w:val="24"/>
-          <w:szCs w:val="24"/>
-          <w:rtl w:val="0"/>
-        </w:rPr>
-        <w:t xml:space="preserve"> reduz visibilidade de D+1 para D+0,25 (75%). A mensuração do funil é habilitada pelo </w:t>
-      </w:r>
-      <w:r>
-        <w:rPr>
-          <w:rFonts w:ascii="Times New Roman" w:cs="Times New Roman" w:eastAsia="Times New Roman" w:hAnsi="Times New Roman"/>
-          <w:i w:val="1"/>
-          <w:iCs w:val="1"/>
-          <w:sz w:val="24"/>
-          <w:szCs w:val="24"/>
-          <w:rtl w:val="0"/>
-        </w:rPr>
-        <w:t xml:space="preserve">streaming</w:t>
-      </w:r>
-      <w:r>
-        <w:rPr>
-          <w:rFonts w:ascii="Times New Roman" w:cs="Times New Roman" w:eastAsia="Times New Roman" w:hAnsi="Times New Roman"/>
-          <w:sz w:val="24"/>
-          <w:szCs w:val="24"/>
-          <w:rtl w:val="0"/>
-        </w:rPr>
-        <w:t xml:space="preserve"> com latência inferior a cinco minutos, validada pela simulação (Flores, 2026): 191.317 eventos, 100% SLA, duas partições PACELC com isolamento celular. A previsão de demanda é sustentada pela disponibilidade de 99,0% e pelas cinco regras de qualidade com disjuntores.</w:t>
-      </w:r>
-    </w:p>
-    <w:p>
-      <w:pPr>
-        <w:spacing w:line="480" w:lineRule="auto"/>
-        <w:ind w:firstLine="720"/>
-        <w:jc w:val="both"/>
-        <w:rPr>
-          <w:rFonts w:ascii="Times New Roman" w:cs="Times New Roman" w:eastAsia="Times New Roman" w:hAnsi="Times New Roman"/>
-          <w:sz w:val="24"/>
-          <w:szCs w:val="24"/>
-        </w:rPr>
-      </w:pPr>
-      <w:r>
-        <w:rPr>
-          <w:rFonts w:ascii="Times New Roman" w:cs="Times New Roman" w:eastAsia="Times New Roman" w:hAnsi="Times New Roman"/>
-          <w:sz w:val="24"/>
-          <w:szCs w:val="24"/>
-          <w:rtl w:val="0"/>
-        </w:rPr>
-        <w:t xml:space="preserve">A conformidade LGPD sobre Parquet imutável é garantida pela destruição criptográfica de chaves por cliente, eliminando a tensão entre imutabilidade analítica e direito de eliminação. A Lei de Conway (1968), validada por MacCormack, Baldwin, e Rusnak (2012), revela que silos de comunicação geram silos de dados; por isso, a arquitetura proposta requer alinhamento entre domínios, governança e modularidade operacional: equipes por domínio produzem, </w:t>
-      </w:r>
-      <w:r>
-        <w:rPr>
-          <w:rFonts w:ascii="Times New Roman" w:cs="Times New Roman" w:eastAsia="Times New Roman" w:hAnsi="Times New Roman"/>
-          <w:i w:val="1"/>
-          <w:iCs w:val="1"/>
-          <w:sz w:val="24"/>
-          <w:szCs w:val="24"/>
-          <w:rtl w:val="0"/>
-        </w:rPr>
-        <w:t xml:space="preserve">ceteris paribus</w:t>
-      </w:r>
-      <w:r>
-        <w:rPr>
-          <w:rFonts w:ascii="Times New Roman" w:cs="Times New Roman" w:eastAsia="Times New Roman" w:hAnsi="Times New Roman"/>
-          <w:sz w:val="24"/>
-          <w:szCs w:val="24"/>
-          <w:rtl w:val="0"/>
-        </w:rPr>
-        <w:t xml:space="preserve">, arquiteturas modulares. O equilíbrio entre inovação, riscos e maturidade é o desafio contínuo da gestão de plataformas de dados.</w:t>
-      </w:r>
-    </w:p>
-    <w:p>
-      <w:pPr>
-        <w:spacing w:line="480" w:lineRule="auto"/>
-        <w:ind w:firstLine="720"/>
-        <w:jc w:val="both"/>
-        <w:rPr>
-          <w:rFonts w:ascii="Times New Roman" w:cs="Times New Roman" w:eastAsia="Times New Roman" w:hAnsi="Times New Roman"/>
-          <w:sz w:val="24"/>
-          <w:szCs w:val="24"/>
-        </w:rPr>
-      </w:pPr>
-      <w:r>
-        <w:rPr>
-          <w:rFonts w:ascii="Times New Roman" w:cs="Times New Roman" w:eastAsia="Times New Roman" w:hAnsi="Times New Roman"/>
-          <w:sz w:val="24"/>
-          <w:szCs w:val="24"/>
-          <w:rtl w:val="0"/>
-        </w:rPr>
-        <w:t xml:space="preserve">Direções futuras: (i) simulação com múltiplas repetições e intervalos de confiança de 95%; (ii) análise de sensibilidade paramétrica; (iii) criptografia pós-quântica. O teorema PACELC (Abadi, 2012) garante que perfeição é inatingível em sistemas distribuídos; a arquitetura proposta representa o equilíbrio ótimo validado por evidência empírica reprodutível.</w:t>
-      </w:r>
-    </w:p>
-    <w:p>
-      <w:pPr>
-        <w:pStyle w:val="Heading1"/>
-        <w:keepNext w:val="0"/>
-        <w:keepLines w:val="0"/>
-        <w:pageBreakBefore w:val="1"/>
-        <w:spacing w:before="240" w:line="480" w:lineRule="auto"/>
-        <w:jc w:val="center"/>
-        <w:rPr>
-          <w:rFonts w:ascii="Times New Roman" w:cs="Times New Roman" w:eastAsia="Times New Roman" w:hAnsi="Times New Roman"/>
-          <w:b w:val="1"/>
-          <w:bCs w:val="1"/>
-          <w:sz w:val="28"/>
-          <w:szCs w:val="28"/>
-        </w:rPr>
-      </w:pPr>
-      <w:r>
-        <w:rPr>
-          <w:rFonts w:ascii="Times New Roman" w:cs="Times New Roman" w:eastAsia="Times New Roman" w:hAnsi="Times New Roman"/>
-          <w:b w:val="1"/>
-          <w:bCs w:val="1"/>
-          <w:sz w:val="24"/>
-          <w:szCs w:val="24"/>
-          <w:rtl w:val="0"/>
-        </w:rPr>
         <w:t xml:space="preserve">Referências</w:t>
       </w:r>
       <w:r>
@@ -3318,7 +3241,27 @@
           <w:szCs w:val="24"/>
           <w:rtl w:val="0"/>
         </w:rPr>
-        <w:t xml:space="preserve">Abadi, D. J. (2012). Consistency tradeoffs in modern distributed database system design: CAP is only part of the story. IEEE Computer, 45(2), 37-42. https://doi.org/10.1109/MC.2012.33</w:t>
+        <w:t xml:space="preserve">Abadi, D. J. (2012). Consistency tradeoffs in modern distributed database system design: CAP is only part of the story. </w:t>
+      </w:r>
+      <w:r>
+        <w:rPr>
+          <w:rFonts w:ascii="Times New Roman" w:cs="Times New Roman" w:eastAsia="Times New Roman" w:hAnsi="Times New Roman"/>
+          <w:i w:val="1"/>
+          <w:iCs w:val="1"/>
+          <w:sz w:val="24"/>
+          <w:szCs w:val="24"/>
+          <w:rtl w:val="0"/>
+        </w:rPr>
+        <w:t xml:space="preserve">IEEE Computer</w:t>
+      </w:r>
+      <w:r>
+        <w:rPr>
+          <w:rFonts w:ascii="Times New Roman" w:cs="Times New Roman" w:eastAsia="Times New Roman" w:hAnsi="Times New Roman"/>
+          <w:sz w:val="24"/>
+          <w:szCs w:val="24"/>
+          <w:rtl w:val="0"/>
+        </w:rPr>
+        <w:t xml:space="preserve">, 45(2), 37-42. https://doi.org/10.1109/MC.2012.33</w:t>
       </w:r>
       <w:r>
         <w:rPr>
@@ -3339,7 +3282,27 @@
           <w:szCs w:val="24"/>
           <w:rtl w:val="0"/>
         </w:rPr>
-        <w:t xml:space="preserve">Amazon Web Services. (2024). Reducing the scope of impact with cell-based architecture. AWS Well-Architected Framework. https://docs.aws.amazon.com/wellarchitected/latest/reducing-scope-of-impact-with-cell-based-architecture/</w:t>
+        <w:t xml:space="preserve">Amazon Web Services. (2024). Reducing the scope of impact with cell-based architecture. </w:t>
+      </w:r>
+      <w:r>
+        <w:rPr>
+          <w:rFonts w:ascii="Times New Roman" w:cs="Times New Roman" w:eastAsia="Times New Roman" w:hAnsi="Times New Roman"/>
+          <w:i w:val="1"/>
+          <w:iCs w:val="1"/>
+          <w:sz w:val="24"/>
+          <w:szCs w:val="24"/>
+          <w:rtl w:val="0"/>
+        </w:rPr>
+        <w:t xml:space="preserve">AWS Well-Architected Framework</w:t>
+      </w:r>
+      <w:r>
+        <w:rPr>
+          <w:rFonts w:ascii="Times New Roman" w:cs="Times New Roman" w:eastAsia="Times New Roman" w:hAnsi="Times New Roman"/>
+          <w:sz w:val="24"/>
+          <w:szCs w:val="24"/>
+          <w:rtl w:val="0"/>
+        </w:rPr>
+        <w:t xml:space="preserve">. https://docs.aws.amazon.com/wellarchitected/latest/reducing-scope-of-impact-with-cell-based-architecture/</w:t>
       </w:r>
       <w:r>
         <w:rPr>
@@ -3360,7 +3323,27 @@
           <w:szCs w:val="24"/>
           <w:rtl w:val="0"/>
         </w:rPr>
-        <w:t xml:space="preserve">Armbrust, M., Ghodsi, A., Xin, R., &amp; Zaharia, M. (2021). Lakehouse: A new generation of open platforms that unify data warehousing and advanced analytics. Proceedings of the 11th CIDR. https://www.cidrdb.org/cidr2021/papers/cidr2021_paper17.pdf</w:t>
+        <w:t xml:space="preserve">Armbrust, M., Ghodsi, A., Xin, R., &amp; Zaharia, M. (2021). Lakehouse: A new generation of open platforms that unify data warehousing and advanced analytics. </w:t>
+      </w:r>
+      <w:r>
+        <w:rPr>
+          <w:rFonts w:ascii="Times New Roman" w:cs="Times New Roman" w:eastAsia="Times New Roman" w:hAnsi="Times New Roman"/>
+          <w:i w:val="1"/>
+          <w:iCs w:val="1"/>
+          <w:sz w:val="24"/>
+          <w:szCs w:val="24"/>
+          <w:rtl w:val="0"/>
+        </w:rPr>
+        <w:t xml:space="preserve">Proceedings of the 11th CIDR</w:t>
+      </w:r>
+      <w:r>
+        <w:rPr>
+          <w:rFonts w:ascii="Times New Roman" w:cs="Times New Roman" w:eastAsia="Times New Roman" w:hAnsi="Times New Roman"/>
+          <w:sz w:val="24"/>
+          <w:szCs w:val="24"/>
+          <w:rtl w:val="0"/>
+        </w:rPr>
+        <w:t xml:space="preserve">. https://www.cidrdb.org/cidr2021/papers/cidr2021_paper17.pdf</w:t>
       </w:r>
       <w:r>
         <w:rPr>
@@ -3381,7 +3364,27 @@
           <w:szCs w:val="24"/>
           <w:rtl w:val="0"/>
         </w:rPr>
-        <w:t xml:space="preserve">Collet, Y., &amp; Kucherawy, M. S. (2021). Zstandard compression and the 'application/zstd' media type. IETF RFC 8878. https://www.rfc-editor.org/rfc/rfc8878.html</w:t>
+        <w:t xml:space="preserve">Collet, Y., &amp; Kucherawy, M. S. (2021). Zstandard compression and the 'application/zstd' media type. </w:t>
+      </w:r>
+      <w:r>
+        <w:rPr>
+          <w:rFonts w:ascii="Times New Roman" w:cs="Times New Roman" w:eastAsia="Times New Roman" w:hAnsi="Times New Roman"/>
+          <w:i w:val="1"/>
+          <w:iCs w:val="1"/>
+          <w:sz w:val="24"/>
+          <w:szCs w:val="24"/>
+          <w:rtl w:val="0"/>
+        </w:rPr>
+        <w:t xml:space="preserve">IETF RFC 8878</w:t>
+      </w:r>
+      <w:r>
+        <w:rPr>
+          <w:rFonts w:ascii="Times New Roman" w:cs="Times New Roman" w:eastAsia="Times New Roman" w:hAnsi="Times New Roman"/>
+          <w:sz w:val="24"/>
+          <w:szCs w:val="24"/>
+          <w:rtl w:val="0"/>
+        </w:rPr>
+        <w:t xml:space="preserve">. https://www.rfc-editor.org/rfc/rfc8878.html</w:t>
       </w:r>
       <w:r>
         <w:rPr>
@@ -3402,7 +3405,27 @@
           <w:szCs w:val="24"/>
           <w:rtl w:val="0"/>
         </w:rPr>
-        <w:t xml:space="preserve">Conway, M. E. (1968). How do committees invent? Datamation, 14(4), 28-31. https://www.melconway.com/Home/Committees_Paper.html</w:t>
+        <w:t xml:space="preserve">Conway, M. E. (1968). How do committees invent? </w:t>
+      </w:r>
+      <w:r>
+        <w:rPr>
+          <w:rFonts w:ascii="Times New Roman" w:cs="Times New Roman" w:eastAsia="Times New Roman" w:hAnsi="Times New Roman"/>
+          <w:i w:val="1"/>
+          <w:iCs w:val="1"/>
+          <w:sz w:val="24"/>
+          <w:szCs w:val="24"/>
+          <w:rtl w:val="0"/>
+        </w:rPr>
+        <w:t xml:space="preserve">Datamation</w:t>
+      </w:r>
+      <w:r>
+        <w:rPr>
+          <w:rFonts w:ascii="Times New Roman" w:cs="Times New Roman" w:eastAsia="Times New Roman" w:hAnsi="Times New Roman"/>
+          <w:sz w:val="24"/>
+          <w:szCs w:val="24"/>
+          <w:rtl w:val="0"/>
+        </w:rPr>
+        <w:t xml:space="preserve">, 14(4), 28-31. https://www.melconway.com/Home/Committees_Paper.html</w:t>
       </w:r>
       <w:r>
         <w:rPr>
@@ -3423,7 +3446,27 @@
           <w:szCs w:val="24"/>
           <w:rtl w:val="0"/>
         </w:rPr>
-        <w:t xml:space="preserve">Dean, J., &amp; Barroso, L. A. (2013). The tail at scale. Communications of the ACM, 56(2), 74-80. https://doi.org/10.1145/2408776.2408794</w:t>
+        <w:t xml:space="preserve">Dean, J., &amp; Barroso, L. A. (2013). The tail at scale. </w:t>
+      </w:r>
+      <w:r>
+        <w:rPr>
+          <w:rFonts w:ascii="Times New Roman" w:cs="Times New Roman" w:eastAsia="Times New Roman" w:hAnsi="Times New Roman"/>
+          <w:i w:val="1"/>
+          <w:iCs w:val="1"/>
+          <w:sz w:val="24"/>
+          <w:szCs w:val="24"/>
+          <w:rtl w:val="0"/>
+        </w:rPr>
+        <w:t xml:space="preserve">Communications of the ACM</w:t>
+      </w:r>
+      <w:r>
+        <w:rPr>
+          <w:rFonts w:ascii="Times New Roman" w:cs="Times New Roman" w:eastAsia="Times New Roman" w:hAnsi="Times New Roman"/>
+          <w:sz w:val="24"/>
+          <w:szCs w:val="24"/>
+          <w:rtl w:val="0"/>
+        </w:rPr>
+        <w:t xml:space="preserve">, 56(2), 74-80. https://doi.org/10.1145/2408776.2408794</w:t>
       </w:r>
       <w:r>
         <w:rPr>
@@ -3444,7 +3487,27 @@
           <w:szCs w:val="24"/>
           <w:rtl w:val="0"/>
         </w:rPr>
-        <w:t xml:space="preserve">Dehghani, Z. (2022). Data mesh: Delivering data-driven value at scale. O’Reilly Media. ISBN: 978-1492092391.</w:t>
+        <w:t xml:space="preserve">Dehghani, Z. (2022). </w:t>
+      </w:r>
+      <w:r>
+        <w:rPr>
+          <w:rFonts w:ascii="Times New Roman" w:cs="Times New Roman" w:eastAsia="Times New Roman" w:hAnsi="Times New Roman"/>
+          <w:i w:val="1"/>
+          <w:iCs w:val="1"/>
+          <w:sz w:val="24"/>
+          <w:szCs w:val="24"/>
+          <w:rtl w:val="0"/>
+        </w:rPr>
+        <w:t xml:space="preserve">Data mesh: Delivering data-driven value at scale</w:t>
+      </w:r>
+      <w:r>
+        <w:rPr>
+          <w:rFonts w:ascii="Times New Roman" w:cs="Times New Roman" w:eastAsia="Times New Roman" w:hAnsi="Times New Roman"/>
+          <w:sz w:val="24"/>
+          <w:szCs w:val="24"/>
+          <w:rtl w:val="0"/>
+        </w:rPr>
+        <w:t xml:space="preserve">. O’Reilly Media. ISBN: 978-1492092391.</w:t>
       </w:r>
       <w:r>
         <w:rPr>
@@ -3465,7 +3528,27 @@
           <w:szCs w:val="24"/>
           <w:rtl w:val="0"/>
         </w:rPr>
-        <w:t xml:space="preserve">FinOps Foundation. (2025). FinOps framework. Linux Foundation. https://www.finops.org/framework/</w:t>
+        <w:t xml:space="preserve">FinOps Foundation. (2025). </w:t>
+      </w:r>
+      <w:r>
+        <w:rPr>
+          <w:rFonts w:ascii="Times New Roman" w:cs="Times New Roman" w:eastAsia="Times New Roman" w:hAnsi="Times New Roman"/>
+          <w:i w:val="1"/>
+          <w:iCs w:val="1"/>
+          <w:sz w:val="24"/>
+          <w:szCs w:val="24"/>
+          <w:rtl w:val="0"/>
+        </w:rPr>
+        <w:t xml:space="preserve">FinOps framework</w:t>
+      </w:r>
+      <w:r>
+        <w:rPr>
+          <w:rFonts w:ascii="Times New Roman" w:cs="Times New Roman" w:eastAsia="Times New Roman" w:hAnsi="Times New Roman"/>
+          <w:sz w:val="24"/>
+          <w:szCs w:val="24"/>
+          <w:rtl w:val="0"/>
+        </w:rPr>
+        <w:t xml:space="preserve">. Linux Foundation. https://www.finops.org/framework/</w:t>
       </w:r>
       <w:r>
         <w:rPr>
@@ -3486,7 +3569,27 @@
           <w:szCs w:val="24"/>
           <w:rtl w:val="0"/>
         </w:rPr>
-        <w:t xml:space="preserve">Flores, C. U. (2026). TechGrowth DES: Stochastic simulation of Kafka-Flink-Iceberg pipeline with PACELC network partition injection. Zenodo. https://doi.org/10.5281/zenodo.19244059</w:t>
+        <w:t xml:space="preserve">Flores, C. U. (2026). </w:t>
+      </w:r>
+      <w:r>
+        <w:rPr>
+          <w:rFonts w:ascii="Times New Roman" w:cs="Times New Roman" w:eastAsia="Times New Roman" w:hAnsi="Times New Roman"/>
+          <w:i w:val="1"/>
+          <w:iCs w:val="1"/>
+          <w:sz w:val="24"/>
+          <w:szCs w:val="24"/>
+          <w:rtl w:val="0"/>
+        </w:rPr>
+        <w:t xml:space="preserve">TechGrowth DES: Stochastic simulation of Kafka-Flink-Iceberg pipeline with PACELC network partition injection</w:t>
+      </w:r>
+      <w:r>
+        <w:rPr>
+          <w:rFonts w:ascii="Times New Roman" w:cs="Times New Roman" w:eastAsia="Times New Roman" w:hAnsi="Times New Roman"/>
+          <w:sz w:val="24"/>
+          <w:szCs w:val="24"/>
+          <w:rtl w:val="0"/>
+        </w:rPr>
+        <w:t xml:space="preserve">. Zenodo. https://doi.org/10.5281/zenodo.19244059</w:t>
       </w:r>
       <w:r>
         <w:rPr>
@@ -3507,7 +3610,27 @@
           <w:szCs w:val="24"/>
           <w:rtl w:val="0"/>
         </w:rPr>
-        <w:t xml:space="preserve">Jain, P., Kraft, P., Power, C., Das, T., Stoica, I., &amp; Zaharia, M. (2023). Analyzing and comparing lakehouse storage systems. Proceedings of the 13th CIDR. https://www.cidrdb.org/cidr2023/papers/p92-jain.pdf</w:t>
+        <w:t xml:space="preserve">Jain, P., Kraft, P., Power, C., Das, T., Stoica, I., &amp; Zaharia, M. (2023). Analyzing and comparing lakehouse storage systems. </w:t>
+      </w:r>
+      <w:r>
+        <w:rPr>
+          <w:rFonts w:ascii="Times New Roman" w:cs="Times New Roman" w:eastAsia="Times New Roman" w:hAnsi="Times New Roman"/>
+          <w:i w:val="1"/>
+          <w:iCs w:val="1"/>
+          <w:sz w:val="24"/>
+          <w:szCs w:val="24"/>
+          <w:rtl w:val="0"/>
+        </w:rPr>
+        <w:t xml:space="preserve">Proceedings of the 13th CIDR</w:t>
+      </w:r>
+      <w:r>
+        <w:rPr>
+          <w:rFonts w:ascii="Times New Roman" w:cs="Times New Roman" w:eastAsia="Times New Roman" w:hAnsi="Times New Roman"/>
+          <w:sz w:val="24"/>
+          <w:szCs w:val="24"/>
+          <w:rtl w:val="0"/>
+        </w:rPr>
+        <w:t xml:space="preserve">. https://www.cidrdb.org/cidr2023/papers/p92-jain.pdf</w:t>
       </w:r>
       <w:r>
         <w:rPr>
@@ -3528,7 +3651,27 @@
           <w:szCs w:val="24"/>
           <w:rtl w:val="0"/>
         </w:rPr>
-        <w:t xml:space="preserve">Chandramouli, R., &amp; Hibbard, E. (2025). Guidelines for media sanitization (NIST SP 800-88 Rev. 2). National Institute of Standards and Technology. https://doi.org/10.6028/NIST.SP.800-88r2</w:t>
+        <w:t xml:space="preserve">Chandramouli, R., &amp; Hibbard, E. (2025). Guidelines for media sanitization (NIST SP 800-88 Rev. 2). </w:t>
+      </w:r>
+      <w:r>
+        <w:rPr>
+          <w:rFonts w:ascii="Times New Roman" w:cs="Times New Roman" w:eastAsia="Times New Roman" w:hAnsi="Times New Roman"/>
+          <w:i w:val="1"/>
+          <w:iCs w:val="1"/>
+          <w:sz w:val="24"/>
+          <w:szCs w:val="24"/>
+          <w:rtl w:val="0"/>
+        </w:rPr>
+        <w:t xml:space="preserve">National Institute of Standards and Technology</w:t>
+      </w:r>
+      <w:r>
+        <w:rPr>
+          <w:rFonts w:ascii="Times New Roman" w:cs="Times New Roman" w:eastAsia="Times New Roman" w:hAnsi="Times New Roman"/>
+          <w:sz w:val="24"/>
+          <w:szCs w:val="24"/>
+          <w:rtl w:val="0"/>
+        </w:rPr>
+        <w:t xml:space="preserve">. https://doi.org/10.6028/NIST.SP.800-88r2</w:t>
       </w:r>
       <w:r>
         <w:rPr>
@@ -3549,7 +3692,27 @@
           <w:szCs w:val="24"/>
           <w:rtl w:val="0"/>
         </w:rPr>
-        <w:t xml:space="preserve">Kreps, J. (2014). Questioning the Lambda architecture. O’Reilly Radar. https://www.oreilly.com/radar/questioning-the-lambda-architecture/</w:t>
+        <w:t xml:space="preserve">Kreps, J. (2014). Questioning the Lambda architecture. </w:t>
+      </w:r>
+      <w:r>
+        <w:rPr>
+          <w:rFonts w:ascii="Times New Roman" w:cs="Times New Roman" w:eastAsia="Times New Roman" w:hAnsi="Times New Roman"/>
+          <w:i w:val="1"/>
+          <w:iCs w:val="1"/>
+          <w:sz w:val="24"/>
+          <w:szCs w:val="24"/>
+          <w:rtl w:val="0"/>
+        </w:rPr>
+        <w:t xml:space="preserve">O’Reilly Radar</w:t>
+      </w:r>
+      <w:r>
+        <w:rPr>
+          <w:rFonts w:ascii="Times New Roman" w:cs="Times New Roman" w:eastAsia="Times New Roman" w:hAnsi="Times New Roman"/>
+          <w:sz w:val="24"/>
+          <w:szCs w:val="24"/>
+          <w:rtl w:val="0"/>
+        </w:rPr>
+        <w:t xml:space="preserve">. https://www.oreilly.com/radar/questioning-the-lambda-architecture/</w:t>
       </w:r>
       <w:r>
         <w:rPr>
@@ -3570,7 +3733,27 @@
           <w:szCs w:val="24"/>
           <w:rtl w:val="0"/>
         </w:rPr>
-        <w:t xml:space="preserve">Little, J. D. C. (1961). A proof for the queuing formula: L = λW. Operations Research, 9(3), 383-387. https://doi.org/10.1287/opre.9.3.383</w:t>
+        <w:t xml:space="preserve">Little, J. D. C. (1961). A proof for the queuing formula: L = λW. </w:t>
+      </w:r>
+      <w:r>
+        <w:rPr>
+          <w:rFonts w:ascii="Times New Roman" w:cs="Times New Roman" w:eastAsia="Times New Roman" w:hAnsi="Times New Roman"/>
+          <w:i w:val="1"/>
+          <w:iCs w:val="1"/>
+          <w:sz w:val="24"/>
+          <w:szCs w:val="24"/>
+          <w:rtl w:val="0"/>
+        </w:rPr>
+        <w:t xml:space="preserve">Operations Research</w:t>
+      </w:r>
+      <w:r>
+        <w:rPr>
+          <w:rFonts w:ascii="Times New Roman" w:cs="Times New Roman" w:eastAsia="Times New Roman" w:hAnsi="Times New Roman"/>
+          <w:sz w:val="24"/>
+          <w:szCs w:val="24"/>
+          <w:rtl w:val="0"/>
+        </w:rPr>
+        <w:t xml:space="preserve">, 9(3), 383-387. https://doi.org/10.1287/opre.9.3.383</w:t>
       </w:r>
       <w:r>
         <w:rPr>
@@ -3591,7 +3774,27 @@
           <w:szCs w:val="24"/>
           <w:rtl w:val="0"/>
         </w:rPr>
-        <w:t xml:space="preserve">MacCárthaigh, C. (2019). Workload isolation using shuffle-sharding. The Amazon Builders’ Library. https://aws.amazon.com/builders-library/workload-isolation-using-shuffle-sharding</w:t>
+        <w:t xml:space="preserve">MacCárthaigh, C. (2019). Workload isolation using shuffle-sharding. </w:t>
+      </w:r>
+      <w:r>
+        <w:rPr>
+          <w:rFonts w:ascii="Times New Roman" w:cs="Times New Roman" w:eastAsia="Times New Roman" w:hAnsi="Times New Roman"/>
+          <w:i w:val="1"/>
+          <w:iCs w:val="1"/>
+          <w:sz w:val="24"/>
+          <w:szCs w:val="24"/>
+          <w:rtl w:val="0"/>
+        </w:rPr>
+        <w:t xml:space="preserve">The Amazon Builders’ Library</w:t>
+      </w:r>
+      <w:r>
+        <w:rPr>
+          <w:rFonts w:ascii="Times New Roman" w:cs="Times New Roman" w:eastAsia="Times New Roman" w:hAnsi="Times New Roman"/>
+          <w:sz w:val="24"/>
+          <w:szCs w:val="24"/>
+          <w:rtl w:val="0"/>
+        </w:rPr>
+        <w:t xml:space="preserve">. https://aws.amazon.com/builders-library/workload-isolation-using-shuffle-sharding</w:t>
       </w:r>
       <w:r>
         <w:rPr>
@@ -3612,7 +3815,27 @@
           <w:szCs w:val="24"/>
           <w:rtl w:val="0"/>
         </w:rPr>
-        <w:t xml:space="preserve">MacCormack, A., Baldwin, C., &amp; Rusnak, J. (2012). Exploring the duality between product and organizational architectures. Research Policy, 41(8), 1309-1324. https://doi.org/10.1016/j.respol.2012.04.011</w:t>
+        <w:t xml:space="preserve">MacCormack, A., Baldwin, C., &amp; Rusnak, J. (2012). Exploring the duality between product and organizational architectures. </w:t>
+      </w:r>
+      <w:r>
+        <w:rPr>
+          <w:rFonts w:ascii="Times New Roman" w:cs="Times New Roman" w:eastAsia="Times New Roman" w:hAnsi="Times New Roman"/>
+          <w:i w:val="1"/>
+          <w:iCs w:val="1"/>
+          <w:sz w:val="24"/>
+          <w:szCs w:val="24"/>
+          <w:rtl w:val="0"/>
+        </w:rPr>
+        <w:t xml:space="preserve">Research Policy</w:t>
+      </w:r>
+      <w:r>
+        <w:rPr>
+          <w:rFonts w:ascii="Times New Roman" w:cs="Times New Roman" w:eastAsia="Times New Roman" w:hAnsi="Times New Roman"/>
+          <w:sz w:val="24"/>
+          <w:szCs w:val="24"/>
+          <w:rtl w:val="0"/>
+        </w:rPr>
+        <w:t xml:space="preserve">, 41(8), 1309-1324. https://doi.org/10.1016/j.respol.2012.04.011</w:t>
       </w:r>
       <w:r>
         <w:rPr>
@@ -3633,7 +3856,27 @@
           <w:szCs w:val="24"/>
           <w:rtl w:val="0"/>
         </w:rPr>
-        <w:t xml:space="preserve">Okolnychyi, A., Sun, C., Tanimura, K., Spitzer, R., Blue, R., Ho, S., Gu, Y., Lakkundi, V., &amp; Tsai, D. B. (2024). Petabyte-scale row-level operations in data lakehouses. Proceedings of the VLDB Endowment, 17(12), 4159-4172. https://doi.org/10.14778/3685800.3685834</w:t>
+        <w:t xml:space="preserve">Okolnychyi, A., Sun, C., Tanimura, K., Spitzer, R., Blue, R., Ho, S., Gu, Y., Lakkundi, V., &amp; Tsai, D. B. (2024). Petabyte-scale row-level operations in data lakehouses. </w:t>
+      </w:r>
+      <w:r>
+        <w:rPr>
+          <w:rFonts w:ascii="Times New Roman" w:cs="Times New Roman" w:eastAsia="Times New Roman" w:hAnsi="Times New Roman"/>
+          <w:i w:val="1"/>
+          <w:iCs w:val="1"/>
+          <w:sz w:val="24"/>
+          <w:szCs w:val="24"/>
+          <w:rtl w:val="0"/>
+        </w:rPr>
+        <w:t xml:space="preserve">Proceedings of the VLDB Endowment</w:t>
+      </w:r>
+      <w:r>
+        <w:rPr>
+          <w:rFonts w:ascii="Times New Roman" w:cs="Times New Roman" w:eastAsia="Times New Roman" w:hAnsi="Times New Roman"/>
+          <w:sz w:val="24"/>
+          <w:szCs w:val="24"/>
+          <w:rtl w:val="0"/>
+        </w:rPr>
+        <w:t xml:space="preserve">, 17(12), 4159-4172. https://doi.org/10.14778/3685800.3685834</w:t>
       </w:r>
       <w:r>
         <w:rPr>
@@ -3654,7 +3897,27 @@
           <w:szCs w:val="24"/>
           <w:rtl w:val="0"/>
         </w:rPr>
-        <w:t xml:space="preserve">Reis, J., &amp; Housley, M. (2022). Fundamentals of data engineering. O’Reilly Media. ISBN: 978-1098108304.</w:t>
+        <w:t xml:space="preserve">Reis, J., &amp; Housley, M. (2022). </w:t>
+      </w:r>
+      <w:r>
+        <w:rPr>
+          <w:rFonts w:ascii="Times New Roman" w:cs="Times New Roman" w:eastAsia="Times New Roman" w:hAnsi="Times New Roman"/>
+          <w:i w:val="1"/>
+          <w:iCs w:val="1"/>
+          <w:sz w:val="24"/>
+          <w:szCs w:val="24"/>
+          <w:rtl w:val="0"/>
+        </w:rPr>
+        <w:t xml:space="preserve">Fundamentals of data engineering</w:t>
+      </w:r>
+      <w:r>
+        <w:rPr>
+          <w:rFonts w:ascii="Times New Roman" w:cs="Times New Roman" w:eastAsia="Times New Roman" w:hAnsi="Times New Roman"/>
+          <w:sz w:val="24"/>
+          <w:szCs w:val="24"/>
+          <w:rtl w:val="0"/>
+        </w:rPr>
+        <w:t xml:space="preserve">. O’Reilly Media. ISBN: 978-1098108304.</w:t>
       </w:r>
       <w:r>
         <w:rPr>
@@ -3675,7 +3938,27 @@
           <w:szCs w:val="24"/>
           <w:rtl w:val="0"/>
         </w:rPr>
-        <w:t xml:space="preserve">Rose, S., Borchert, O., Mitchell, S., &amp; Connelly, S. (2020). Zero trust architecture (NIST SP 800-207). https://doi.org/10.6028/NIST.SP.800-207</w:t>
+        <w:t xml:space="preserve">Rose, S., Borchert, O., Mitchell, S., &amp; Connelly, S. (2020). </w:t>
+      </w:r>
+      <w:r>
+        <w:rPr>
+          <w:rFonts w:ascii="Times New Roman" w:cs="Times New Roman" w:eastAsia="Times New Roman" w:hAnsi="Times New Roman"/>
+          <w:i w:val="1"/>
+          <w:iCs w:val="1"/>
+          <w:sz w:val="24"/>
+          <w:szCs w:val="24"/>
+          <w:rtl w:val="0"/>
+        </w:rPr>
+        <w:t xml:space="preserve">Zero trust architecture (NIST SP 800-207)</w:t>
+      </w:r>
+      <w:r>
+        <w:rPr>
+          <w:rFonts w:ascii="Times New Roman" w:cs="Times New Roman" w:eastAsia="Times New Roman" w:hAnsi="Times New Roman"/>
+          <w:sz w:val="24"/>
+          <w:szCs w:val="24"/>
+          <w:rtl w:val="0"/>
+        </w:rPr>
+        <w:t xml:space="preserve">. https://doi.org/10.6028/NIST.SP.800-207</w:t>
       </w:r>
       <w:r>
         <w:rPr>
@@ -3696,7 +3979,27 @@
           <w:szCs w:val="24"/>
           <w:rtl w:val="0"/>
         </w:rPr>
-        <w:t xml:space="preserve">Uttamchandani, S. (2018). Taming data quality with circuit breakers. O’Reilly Strata Data Conference. https://modern-cdo.medium.com/taming-data-quality-with-circuit-breakers-dbe550d3ca78</w:t>
+        <w:t xml:space="preserve">Uttamchandani, S. (2018). Taming data quality with circuit breakers. </w:t>
+      </w:r>
+      <w:r>
+        <w:rPr>
+          <w:rFonts w:ascii="Times New Roman" w:cs="Times New Roman" w:eastAsia="Times New Roman" w:hAnsi="Times New Roman"/>
+          <w:i w:val="1"/>
+          <w:iCs w:val="1"/>
+          <w:sz w:val="24"/>
+          <w:szCs w:val="24"/>
+          <w:rtl w:val="0"/>
+        </w:rPr>
+        <w:t xml:space="preserve">O’Reilly Strata Data Conference</w:t>
+      </w:r>
+      <w:r>
+        <w:rPr>
+          <w:rFonts w:ascii="Times New Roman" w:cs="Times New Roman" w:eastAsia="Times New Roman" w:hAnsi="Times New Roman"/>
+          <w:sz w:val="24"/>
+          <w:szCs w:val="24"/>
+          <w:rtl w:val="0"/>
+        </w:rPr>
+        <w:t xml:space="preserve">. https://modern-cdo.medium.com/taming-data-quality-with-circuit-breakers-dbe550d3ca78</w:t>
       </w:r>
       <w:r>
         <w:rPr>
@@ -3708,167 +4011,61 @@
       <w:pPr>
         <w:spacing w:line="480" w:lineRule="auto"/>
         <w:ind w:left="720"/>
-        <w:rPr/>
-      </w:pPr>
-      <w:r>
-        <w:rPr>
-          <w:rFonts w:ascii="Times New Roman" w:cs="Times New Roman" w:eastAsia="Times New Roman" w:hAnsi="Times New Roman"/>
-          <w:sz w:val="24"/>
-          <w:szCs w:val="24"/>
-          <w:rtl w:val="0"/>
-        </w:rPr>
-        <w:t xml:space="preserve">Wang, G., Chen, L., Dikshit, A., Gustafson, J., Chen, B., Sax, M. J., Roesler, J., Blee-Goldman, S., Cadonna, B., Mehta, A., Madan, V., &amp; Rao, J. (2021). Consistency and completeness: Rethinking distributed stream processing in Apache Kafka. Proceedings of the 2021 ACM SIGMOD, 2602-2613. https://doi.org/10.1145/3448016.3457556</w:t>
-      </w:r>
-      <w:r>
-        <w:rPr>
-          <w:rtl w:val="0"/>
-        </w:rPr>
-      </w:r>
-    </w:p>
-    <w:p>
-      <w:pPr>
-        <w:pStyle w:val="Heading1"/>
-        <w:keepNext w:val="0"/>
-        <w:keepLines w:val="0"/>
-        <w:spacing w:before="240" w:line="480" w:lineRule="auto"/>
-        <w:rPr>
-          <w:rFonts w:ascii="Times New Roman" w:cs="Times New Roman" w:eastAsia="Times New Roman" w:hAnsi="Times New Roman"/>
-          <w:b w:val="1"/>
-          <w:bCs w:val="1"/>
-          <w:sz w:val="28"/>
-          <w:szCs w:val="28"/>
-        </w:rPr>
-      </w:pPr>
-      <w:r>
-        <w:rPr>
-          <w:rtl w:val="0"/>
-        </w:rPr>
-      </w:r>
-    </w:p>
-    <w:p>
-      <w:pPr>
-        <w:pStyle w:val="Heading1"/>
-        <w:keepNext w:val="0"/>
-        <w:keepLines w:val="0"/>
-        <w:spacing w:before="240" w:line="480" w:lineRule="auto"/>
-        <w:rPr>
-          <w:rFonts w:ascii="Times New Roman" w:cs="Times New Roman" w:eastAsia="Times New Roman" w:hAnsi="Times New Roman"/>
-          <w:b w:val="1"/>
-          <w:bCs w:val="1"/>
-          <w:sz w:val="28"/>
-          <w:szCs w:val="28"/>
-        </w:rPr>
-      </w:pPr>
-      <w:r>
-        <w:rPr>
-          <w:rtl w:val="0"/>
-        </w:rPr>
-      </w:r>
-    </w:p>
-    <w:p>
-      <w:pPr>
-        <w:pStyle w:val="Heading1"/>
-        <w:keepNext w:val="0"/>
-        <w:keepLines w:val="0"/>
-        <w:spacing w:before="240" w:line="480" w:lineRule="auto"/>
-        <w:rPr>
-          <w:rFonts w:ascii="Times New Roman" w:cs="Times New Roman" w:eastAsia="Times New Roman" w:hAnsi="Times New Roman"/>
-          <w:b w:val="1"/>
-          <w:bCs w:val="1"/>
-          <w:sz w:val="28"/>
-          <w:szCs w:val="28"/>
-        </w:rPr>
-      </w:pPr>
-      <w:r>
-        <w:rPr>
-          <w:rtl w:val="0"/>
-        </w:rPr>
-      </w:r>
-    </w:p>
-    <w:p>
-      <w:pPr>
-        <w:pStyle w:val="Heading1"/>
-        <w:keepNext w:val="0"/>
-        <w:keepLines w:val="0"/>
-        <w:spacing w:before="240" w:line="480" w:lineRule="auto"/>
-        <w:rPr>
-          <w:rFonts w:ascii="Times New Roman" w:cs="Times New Roman" w:eastAsia="Times New Roman" w:hAnsi="Times New Roman"/>
-          <w:b w:val="1"/>
-          <w:bCs w:val="1"/>
-          <w:sz w:val="28"/>
-          <w:szCs w:val="28"/>
-        </w:rPr>
-      </w:pPr>
-      <w:r>
-        <w:rPr>
-          <w:rtl w:val="0"/>
-        </w:rPr>
-      </w:r>
-    </w:p>
-    <w:p>
-      <w:pPr>
-        <w:pStyle w:val="Heading1"/>
-        <w:keepNext w:val="0"/>
-        <w:keepLines w:val="0"/>
-        <w:spacing w:before="240" w:line="480" w:lineRule="auto"/>
-        <w:rPr>
-          <w:rFonts w:ascii="Times New Roman" w:cs="Times New Roman" w:eastAsia="Times New Roman" w:hAnsi="Times New Roman"/>
-          <w:b w:val="1"/>
-          <w:bCs w:val="1"/>
-          <w:sz w:val="28"/>
-          <w:szCs w:val="28"/>
-        </w:rPr>
-      </w:pPr>
-      <w:r>
-        <w:rPr>
-          <w:rtl w:val="0"/>
-        </w:rPr>
-      </w:r>
-    </w:p>
-    <w:p>
-      <w:pPr>
-        <w:pStyle w:val="Heading1"/>
-        <w:keepNext w:val="0"/>
-        <w:keepLines w:val="0"/>
-        <w:spacing w:before="240" w:line="480" w:lineRule="auto"/>
-        <w:rPr>
-          <w:rFonts w:ascii="Times New Roman" w:cs="Times New Roman" w:eastAsia="Times New Roman" w:hAnsi="Times New Roman"/>
-          <w:b w:val="1"/>
-          <w:bCs w:val="1"/>
-          <w:sz w:val="28"/>
-          <w:szCs w:val="28"/>
-        </w:rPr>
-      </w:pPr>
-      <w:r>
-        <w:rPr>
-          <w:rtl w:val="0"/>
-        </w:rPr>
-      </w:r>
-    </w:p>
-    <w:p>
-      <w:pPr>
-        <w:pStyle w:val="Heading1"/>
-        <w:keepNext w:val="0"/>
-        <w:keepLines w:val="0"/>
-        <w:spacing w:before="240" w:line="480" w:lineRule="auto"/>
-        <w:rPr>
-          <w:rFonts w:ascii="Times New Roman" w:cs="Times New Roman" w:eastAsia="Times New Roman" w:hAnsi="Times New Roman"/>
-          <w:b w:val="1"/>
-          <w:bCs w:val="1"/>
-          <w:sz w:val="28"/>
-          <w:szCs w:val="28"/>
-        </w:rPr>
-      </w:pPr>
-      <w:r>
-        <w:rPr>
-          <w:rtl w:val="0"/>
-        </w:rPr>
-      </w:r>
-    </w:p>
-    <w:p>
-      <w:pPr>
-        <w:spacing w:line="480" w:lineRule="auto"/>
-        <w:jc w:val="left"/>
+        <w:rPr>
+          <w:rFonts w:ascii="Times New Roman" w:cs="Times New Roman" w:eastAsia="Times New Roman" w:hAnsi="Times New Roman"/>
+          <w:b w:val="0"/>
+          <w:bCs w:val="0"/>
+          <w:i w:val="0"/>
+          <w:iCs w:val="0"/>
+          <w:smallCaps w:val="0"/>
+          <w:strike w:val="0"/>
+          <w:color w:val="000000"/>
+          <w:sz w:val="24"/>
+          <w:szCs w:val="24"/>
+          <w:u w:val="none"/>
+          <w:shd w:fill="auto" w:val="clear"/>
+          <w:vertAlign w:val="baseline"/>
+        </w:rPr>
+      </w:pPr>
+      <w:r>
+        <w:rPr>
+          <w:rFonts w:ascii="Times New Roman" w:cs="Times New Roman" w:eastAsia="Times New Roman" w:hAnsi="Times New Roman"/>
+          <w:sz w:val="24"/>
+          <w:szCs w:val="24"/>
+          <w:rtl w:val="0"/>
+        </w:rPr>
+        <w:t xml:space="preserve">Wang, G., Chen, L., Dikshit, A., Gustafson, J., Chen, B., Sax, M. J., Roesler, J., Blee-Goldman, S., Cadonna, B., Mehta, A., Madan, V., &amp; Rao, J. (2021). Consistency and completeness: Rethinking distributed stream processing in Apache Kafka. </w:t>
+      </w:r>
+      <w:r>
+        <w:rPr>
+          <w:rFonts w:ascii="Times New Roman" w:cs="Times New Roman" w:eastAsia="Times New Roman" w:hAnsi="Times New Roman"/>
+          <w:i w:val="1"/>
+          <w:iCs w:val="1"/>
+          <w:sz w:val="24"/>
+          <w:szCs w:val="24"/>
+          <w:rtl w:val="0"/>
+        </w:rPr>
+        <w:t xml:space="preserve">Proceedings of the 2021 ACM SIGMOD</w:t>
+      </w:r>
+      <w:r>
+        <w:rPr>
+          <w:rFonts w:ascii="Times New Roman" w:cs="Times New Roman" w:eastAsia="Times New Roman" w:hAnsi="Times New Roman"/>
+          <w:sz w:val="24"/>
+          <w:szCs w:val="24"/>
+          <w:rtl w:val="0"/>
+        </w:rPr>
+        <w:t xml:space="preserve">, 2602-2613. https://doi.org/10.1145/3448016.3457556</w:t>
+      </w:r>
+      <w:r>
+        <w:rPr>
+          <w:rtl w:val="0"/>
+        </w:rPr>
+      </w:r>
+    </w:p>
+    <w:p>
+      <w:pPr>
+        <w:spacing w:line="480" w:lineRule="auto"/>
+        <w:ind w:left="720"/>
         <w:rPr>
           <w:rFonts w:ascii="Times New Roman" w:cs="Times New Roman" w:eastAsia="Times New Roman" w:hAnsi="Times New Roman"/>
           <w:sz w:val="24"/>

</xml_diff>